<commit_message>
tuần 3 + 4
</commit_message>
<xml_diff>
--- a/Docs/Báo cáo tổng hợp thực tập tuần 8-10.docx
+++ b/Docs/Báo cáo tổng hợp thực tập tuần 8-10.docx
@@ -29,12 +29,12 @@
           <w:color w:val="0284C7"/>
           <w:sz w:val="27"/>
         </w:rPr>
-        <w:t>TỔNG KẾT GIAI ĐOẠN HOÀN THIỆN MODULE NHẬP DỮ LIỆU EXCEL (TUẦN 8 – 10)</w:t>
+        <w:t>TỔNG KẾT GIAI ĐOẠN HOÀN THIỆN MODULE IMPORT EXCEL THÔNG MINH (TUẦN 8 – 10)</w:t>
       </w:r>
     </w:p>
     <w:p>
       <w:pPr>
-        <w:spacing w:before="240" w:after="100"/>
+        <w:spacing w:before="260" w:after="100"/>
       </w:pPr>
       <w:r>
         <w:rPr>
@@ -67,7 +67,7 @@
       <w:tr>
         <w:tc>
           <w:tcPr>
-            <w:tcW w:type="dxa" w:w="2880"/>
+            <w:tcW w:type="dxa" w:w="3024"/>
             <w:shd w:fill="F8FAFC"/>
             <w:tcMar>
               <w:top w:w="70" w:type="dxa"/>
@@ -93,7 +93,7 @@
         </w:tc>
         <w:tc>
           <w:tcPr>
-            <w:tcW w:type="dxa" w:w="6768"/>
+            <w:tcW w:type="dxa" w:w="6624"/>
             <w:tcMar>
               <w:top w:w="70" w:type="dxa"/>
               <w:bottom w:w="70" w:type="dxa"/>
@@ -120,7 +120,7 @@
       <w:tr>
         <w:tc>
           <w:tcPr>
-            <w:tcW w:type="dxa" w:w="2880"/>
+            <w:tcW w:type="dxa" w:w="3024"/>
             <w:shd w:fill="F8FAFC"/>
             <w:tcMar>
               <w:top w:w="70" w:type="dxa"/>
@@ -146,7 +146,7 @@
         </w:tc>
         <w:tc>
           <w:tcPr>
-            <w:tcW w:type="dxa" w:w="6768"/>
+            <w:tcW w:type="dxa" w:w="6624"/>
             <w:tcMar>
               <w:top w:w="70" w:type="dxa"/>
               <w:bottom w:w="70" w:type="dxa"/>
@@ -173,7 +173,7 @@
       <w:tr>
         <w:tc>
           <w:tcPr>
-            <w:tcW w:type="dxa" w:w="2880"/>
+            <w:tcW w:type="dxa" w:w="3024"/>
             <w:shd w:fill="F8FAFC"/>
             <w:tcMar>
               <w:top w:w="70" w:type="dxa"/>
@@ -199,7 +199,7 @@
         </w:tc>
         <w:tc>
           <w:tcPr>
-            <w:tcW w:type="dxa" w:w="6768"/>
+            <w:tcW w:type="dxa" w:w="6624"/>
             <w:tcMar>
               <w:top w:w="70" w:type="dxa"/>
               <w:bottom w:w="70" w:type="dxa"/>
@@ -225,7 +225,7 @@
       <w:tr>
         <w:tc>
           <w:tcPr>
-            <w:tcW w:type="dxa" w:w="2880"/>
+            <w:tcW w:type="dxa" w:w="3024"/>
             <w:shd w:fill="F8FAFC"/>
             <w:tcMar>
               <w:top w:w="70" w:type="dxa"/>
@@ -251,7 +251,7 @@
         </w:tc>
         <w:tc>
           <w:tcPr>
-            <w:tcW w:type="dxa" w:w="6768"/>
+            <w:tcW w:type="dxa" w:w="6624"/>
             <w:tcMar>
               <w:top w:w="70" w:type="dxa"/>
               <w:bottom w:w="70" w:type="dxa"/>
@@ -277,7 +277,7 @@
       <w:tr>
         <w:tc>
           <w:tcPr>
-            <w:tcW w:type="dxa" w:w="2880"/>
+            <w:tcW w:type="dxa" w:w="3024"/>
             <w:shd w:fill="F8FAFC"/>
             <w:tcMar>
               <w:top w:w="70" w:type="dxa"/>
@@ -303,7 +303,7 @@
         </w:tc>
         <w:tc>
           <w:tcPr>
-            <w:tcW w:type="dxa" w:w="6768"/>
+            <w:tcW w:type="dxa" w:w="6624"/>
             <w:tcMar>
               <w:top w:w="70" w:type="dxa"/>
               <w:bottom w:w="70" w:type="dxa"/>
@@ -329,7 +329,7 @@
       <w:tr>
         <w:tc>
           <w:tcPr>
-            <w:tcW w:type="dxa" w:w="2880"/>
+            <w:tcW w:type="dxa" w:w="3024"/>
             <w:shd w:fill="F8FAFC"/>
             <w:tcMar>
               <w:top w:w="70" w:type="dxa"/>
@@ -349,13 +349,13 @@
                 <w:color w:val="1E293B"/>
                 <w:sz w:val="23"/>
               </w:rPr>
-              <w:t>Cán bộ hướng dẫn</w:t>
+              <w:t>Cán bộ hướng dẫn tại đơn vị</w:t>
             </w:r>
           </w:p>
         </w:tc>
         <w:tc>
           <w:tcPr>
-            <w:tcW w:type="dxa" w:w="6768"/>
+            <w:tcW w:type="dxa" w:w="6624"/>
             <w:tcMar>
               <w:top w:w="70" w:type="dxa"/>
               <w:bottom w:w="70" w:type="dxa"/>
@@ -382,7 +382,7 @@
       <w:tr>
         <w:tc>
           <w:tcPr>
-            <w:tcW w:type="dxa" w:w="2880"/>
+            <w:tcW w:type="dxa" w:w="3024"/>
             <w:shd w:fill="F8FAFC"/>
             <w:tcMar>
               <w:top w:w="70" w:type="dxa"/>
@@ -408,7 +408,7 @@
         </w:tc>
         <w:tc>
           <w:tcPr>
-            <w:tcW w:type="dxa" w:w="6768"/>
+            <w:tcW w:type="dxa" w:w="6624"/>
             <w:tcMar>
               <w:top w:w="70" w:type="dxa"/>
               <w:bottom w:w="70" w:type="dxa"/>
@@ -434,7 +434,7 @@
       <w:tr>
         <w:tc>
           <w:tcPr>
-            <w:tcW w:type="dxa" w:w="2880"/>
+            <w:tcW w:type="dxa" w:w="3024"/>
             <w:shd w:fill="F8FAFC"/>
             <w:tcMar>
               <w:top w:w="70" w:type="dxa"/>
@@ -460,7 +460,7 @@
         </w:tc>
         <w:tc>
           <w:tcPr>
-            <w:tcW w:type="dxa" w:w="6768"/>
+            <w:tcW w:type="dxa" w:w="6624"/>
             <w:tcMar>
               <w:top w:w="70" w:type="dxa"/>
               <w:bottom w:w="70" w:type="dxa"/>
@@ -501,7 +501,7 @@
           <w:color w:val="0F172A"/>
           <w:sz w:val="24"/>
         </w:rPr>
-        <w:t xml:space="preserve">Mục tiêu tổng hợp: </w:t>
+        <w:t xml:space="preserve">Căn cứ và mục tiêu tổng hợp: </w:t>
       </w:r>
       <w:r>
         <w:rPr>
@@ -510,12 +510,12 @@
           <w:color w:val="1E293B"/>
           <w:sz w:val="24"/>
         </w:rPr>
-        <w:t>Báo cáo này tổng hợp toàn bộ quá trình nghiên cứu, xây dựng và hoàn thiện module nhập dữ liệu Excel trong giai đoạn 3 tuần cuối (Tuần 8 đến Tuần 10) của kỳ thực tập tốt nghiệp tại Khối Chính phủ số (eGov) thuộc Công ty TNHH Nền tảng chuyển đổi số Việt Nam. Giai đoạn này tập trung vào việc đưa kết quả mô hình nhận diện cấu trúc vào ứng dụng thực tế trên giao diện người dùng, hoàn thiện trải nghiệm xem trước dữ liệu, phòng ngừa ngoại lệ và lưu trữ kết quả an toàn.</w:t>
+        <w:t>Báo cáo này tổng hợp toàn bộ kết quả nghiên cứu, xây dựng và thử nghiệm nghiệm thu trong giai đoạn 3 tuần cuối (Tuần 8 đến Tuần 10) theo đúng Kế hoạch học tập của sinh viên (Biểu 2) thuộc học phần Thực tập tốt nghiệp, ngành Khoa học máy tính, Trường Đại học Xây dựng Hà Nội. Địa điểm thực tập tại Khối Chính phủ số (eGov) thuộc Công ty TNHH Nền tảng chuyển đổi số Việt Nam dưới sự hướng dẫn của cán bộ Đào Đức Văn.</w:t>
       </w:r>
     </w:p>
     <w:p>
       <w:pPr>
-        <w:spacing w:before="240" w:after="100"/>
+        <w:spacing w:before="260" w:after="100"/>
       </w:pPr>
       <w:r>
         <w:rPr>
@@ -524,7 +524,22 @@
           <w:color w:val="0F172A"/>
           <w:sz w:val="28"/>
         </w:rPr>
-        <w:t>II. TỔNG HỢP NỘI DUNG VÀ KẾT QUẢ TỪNG TUẦN</w:t>
+        <w:t>II. TỔNG HỢP NỘI DUNG VÀ KẾT QUẢ ĐỐI CHIẾU KẾ HOẠCH HỌC TẬP (BIỂU 2)</w:t>
+      </w:r>
+    </w:p>
+    <w:p>
+      <w:pPr>
+        <w:spacing w:before="40" w:after="80" w:line="300" w:lineRule="auto"/>
+        <w:jc w:val="both"/>
+      </w:pPr>
+      <w:r>
+        <w:rPr>
+          <w:rFonts w:ascii="Times New Roman" w:hAnsi="Times New Roman"/>
+          <w:i w:val="0"/>
+          <w:color w:val="1E293B"/>
+          <w:sz w:val="24"/>
+        </w:rPr>
+        <w:t>Dưới đây là Sơ đồ hoạt động tổng thể của toàn bộ phân hệ Import Excel thông minh từ khâu tiếp nhận tệp tin đến lưu trữ kết quả an toàn:</w:t>
       </w:r>
     </w:p>
     <w:p>
@@ -575,16 +590,17 @@
       <w:r>
         <w:rPr>
           <w:rFonts w:ascii="Times New Roman" w:hAnsi="Times New Roman"/>
+          <w:b/>
           <w:i/>
           <w:color w:val="334155"/>
           <w:sz w:val="21"/>
         </w:rPr>
-        <w:t>Hình 1. Quy trình tổng thể nhập, kiểm tra, xem trước và lưu dữ liệu Excel.</w:t>
+        <w:t>Hình 1. Sơ đồ hoạt động tổng thể quy trình nhập, kiểm tra, xem trước và lưu dữ liệu Excel.</w:t>
       </w:r>
     </w:p>
     <w:p>
       <w:pPr>
-        <w:spacing w:before="180" w:after="60"/>
+        <w:spacing w:before="200" w:after="60"/>
       </w:pPr>
       <w:r>
         <w:rPr>
@@ -593,7 +609,7 @@
           <w:color w:val="1E293B"/>
           <w:sz w:val="25"/>
         </w:rPr>
-        <w:t>1. Tuần 8: Xây dựng màn hình chọn tệp và bảng xem trước dữ liệu</w:t>
+        <w:t>1. Tuần 8: Dựng lưới Preview đa cấp bằng Handsontable</w:t>
       </w:r>
     </w:p>
     <w:p>
@@ -609,7 +625,7 @@
           <w:color w:val="0F172A"/>
           <w:sz w:val="24"/>
         </w:rPr>
-        <w:t xml:space="preserve">Giao diện chọn tệp: </w:t>
+        <w:t xml:space="preserve">Nhiệm vụ theo Biểu 2: </w:t>
       </w:r>
       <w:r>
         <w:rPr>
@@ -617,7 +633,7 @@
           <w:color w:val="1E293B"/>
           <w:sz w:val="24"/>
         </w:rPr>
-        <w:t>Thiết kế khu vực tiếp nhận tệp tin hỗ trợ kéo thả và chọn tệp từ máy tính, kiểm tra điều kiện định dạng (.xlsx, .xlsm) và dung lượng tệp tin (tối đa 50 MB);</w:t>
+        <w:t>Lập trình Frontend: Dùng thư viện Handsontable vẽ lưới Preview đa cấp, hiển thị số liệu AI đã map lên giao diện web.</w:t>
       </w:r>
     </w:p>
     <w:p>
@@ -633,7 +649,7 @@
           <w:color w:val="0F172A"/>
           <w:sz w:val="24"/>
         </w:rPr>
-        <w:t xml:space="preserve">Bảng xem trước: </w:t>
+        <w:t xml:space="preserve">Kết quả đạt được: </w:t>
       </w:r>
       <w:r>
         <w:rPr>
@@ -641,7 +657,21 @@
           <w:color w:val="1E293B"/>
           <w:sz w:val="24"/>
         </w:rPr>
-        <w:t>Dựng thành công bảng xem trước dữ liệu đa tầng, tái tạo trung thực cấu trúc tiêu đề nhiều tầng và các ô gộp của mẫu biểu thống kê tư pháp phức tạp (Mẫu 21a);</w:t>
+        <w:t>Lưới hiển thị chuẩn xác cấu trúc Excel gốc kèm số liệu (Mẫu 21a: 13 cột, 6 tầng header, 78 ô gộp, cố định tiêu đề, chế độ chỉ đọc bảo vệ dữ liệu).</w:t>
+      </w:r>
+    </w:p>
+    <w:p>
+      <w:pPr>
+        <w:spacing w:before="200" w:after="60"/>
+      </w:pPr>
+      <w:r>
+        <w:rPr>
+          <w:rFonts w:ascii="Times New Roman" w:hAnsi="Times New Roman"/>
+          <w:b/>
+          <w:color w:val="1E293B"/>
+          <w:sz w:val="25"/>
+        </w:rPr>
+        <w:t>2. Tuần 9: Tối ưu UI/UX và Cache tự học giảm tải gọi AI</w:t>
       </w:r>
     </w:p>
     <w:p>
@@ -657,7 +687,7 @@
           <w:color w:val="0F172A"/>
           <w:sz w:val="24"/>
         </w:rPr>
-        <w:t xml:space="preserve">Trải nghiệm bảng biểu: </w:t>
+        <w:t xml:space="preserve">Nhiệm vụ theo Biểu 2: </w:t>
       </w:r>
       <w:r>
         <w:rPr>
@@ -665,21 +695,7 @@
           <w:color w:val="1E293B"/>
           <w:sz w:val="24"/>
         </w:rPr>
-        <w:t>Hỗ trợ cuộn bảng hai chiều dọc/ngang, cố định tiêu đề phía trên và đặt bảng ở chế độ chỉ đọc để bảo vệ tính toàn vẹn của dữ liệu gốc.</w:t>
-      </w:r>
-    </w:p>
-    <w:p>
-      <w:pPr>
-        <w:spacing w:before="180" w:after="60"/>
-      </w:pPr>
-      <w:r>
-        <w:rPr>
-          <w:rFonts w:ascii="Times New Roman" w:hAnsi="Times New Roman"/>
-          <w:b/>
-          <w:color w:val="1E293B"/>
-          <w:sz w:val="25"/>
-        </w:rPr>
-        <w:t>2. Tuần 9: Tinh gọn giao diện và xử lý tệp có nhiều bảng tính</w:t>
+        <w:t>Tối ưu UI/UX: Bắt sự kiện người dùng sửa lỗi trực tiếp trên lưới Handsontable, lưu vào Cache để hệ thống tự học cho lần sau.</w:t>
       </w:r>
     </w:p>
     <w:p>
@@ -695,7 +711,7 @@
           <w:color w:val="0F172A"/>
           <w:sz w:val="24"/>
         </w:rPr>
-        <w:t xml:space="preserve">Tinh gọn giao diện: </w:t>
+        <w:t xml:space="preserve">Kết quả đạt được: </w:t>
       </w:r>
       <w:r>
         <w:rPr>
@@ -703,7 +719,21 @@
           <w:color w:val="1E293B"/>
           <w:sz w:val="24"/>
         </w:rPr>
-        <w:t>Rà soát và tinh giản các thành phần hiển thị, loại bỏ thông số kỹ thuật trừu tượng, tập trung vào hai bước nghiệp vụ rõ ràng;</w:t>
+        <w:t>Module tự cải thiện độ chính xác, giảm số lần gọi AI (bắt sự kiện afterChange, lưu Cache 2 tầng Client/Server, tự động điền giá trị đã học ở các lần nộp sau).</w:t>
+      </w:r>
+    </w:p>
+    <w:p>
+      <w:pPr>
+        <w:spacing w:before="200" w:after="60"/>
+      </w:pPr>
+      <w:r>
+        <w:rPr>
+          <w:rFonts w:ascii="Times New Roman" w:hAnsi="Times New Roman"/>
+          <w:b/>
+          <w:color w:val="1E293B"/>
+          <w:sz w:val="25"/>
+        </w:rPr>
+        <w:t>3. Tuần 10: Xử lý ngoại lệ và Kiểm thử toàn trình</w:t>
       </w:r>
     </w:p>
     <w:p>
@@ -719,7 +749,7 @@
           <w:color w:val="0F172A"/>
           <w:sz w:val="24"/>
         </w:rPr>
-        <w:t xml:space="preserve">Xử lý nhiều bảng: </w:t>
+        <w:t xml:space="preserve">Nhiệm vụ theo Biểu 2: </w:t>
       </w:r>
       <w:r>
         <w:rPr>
@@ -727,7 +757,7 @@
           <w:color w:val="1E293B"/>
           <w:sz w:val="24"/>
         </w:rPr>
-        <w:t>Bổ sung hệ thống thẻ chuyển đổi tab (Sheet Tabs) linh hoạt khi tệp Excel có nhiều trang tính hoặc nhiều bảng biểu;</w:t>
+        <w:t>Xử lý ngoại lệ và Kiểm thử: Bắt lỗi file Excel rác, test toàn bộ luồng từ Upload -&gt; AI Mapping -&gt; Lưu báo cáo.</w:t>
       </w:r>
     </w:p>
     <w:p>
@@ -743,7 +773,7 @@
           <w:color w:val="0F172A"/>
           <w:sz w:val="24"/>
         </w:rPr>
-        <w:t xml:space="preserve">Tối ưu hiệu năng: </w:t>
+        <w:t xml:space="preserve">Kết quả đạt được: </w:t>
       </w:r>
       <w:r>
         <w:rPr>
@@ -751,98 +781,12 @@
           <w:color w:val="1E293B"/>
           <w:sz w:val="24"/>
         </w:rPr>
-        <w:t>Tối ưu hóa hiệu năng kết xuất dữ liệu và kiểm soát thanh tiến trình trạng thái trong suốt quá trình xử lý.</w:t>
+        <w:t>Module AI chạy ổn định, không xung đột với hệ thống cũ (chặn tệp rỗng 0 bytes, tệp hỏng OpenXML / Magic Byte PK, lưu cơ sở dữ liệu biệt lập import_records an toàn).</w:t>
       </w:r>
     </w:p>
     <w:p>
       <w:pPr>
-        <w:spacing w:before="180" w:after="60"/>
-      </w:pPr>
-      <w:r>
-        <w:rPr>
-          <w:rFonts w:ascii="Times New Roman" w:hAnsi="Times New Roman"/>
-          <w:b/>
-          <w:color w:val="1E293B"/>
-          <w:sz w:val="25"/>
-        </w:rPr>
-        <w:t>3. Tuần 10: Xử lý ngoại lệ toàn diện và lưu trữ an toàn</w:t>
-      </w:r>
-    </w:p>
-    <w:p>
-      <w:pPr>
-        <w:pStyle w:val="ListBullet"/>
-        <w:spacing w:before="40" w:after="60" w:line="288" w:lineRule="auto"/>
-        <w:jc w:val="both"/>
-      </w:pPr>
-      <w:r>
-        <w:rPr>
-          <w:rFonts w:ascii="Times New Roman" w:hAnsi="Times New Roman"/>
-          <w:b/>
-          <w:color w:val="0F172A"/>
-          <w:sz w:val="24"/>
-        </w:rPr>
-        <w:t xml:space="preserve">Phòng vệ ngoại lệ: </w:t>
-      </w:r>
-      <w:r>
-        <w:rPr>
-          <w:rFonts w:ascii="Times New Roman" w:hAnsi="Times New Roman"/>
-          <w:color w:val="1E293B"/>
-          <w:sz w:val="24"/>
-        </w:rPr>
-        <w:t>Xây dựng cơ chế phòng vệ hai lớp: chặn tệp rỗng 0 bytes ngay tại giao diện và kiểm tra chữ ký nhị phân OpenXML (Magic Bytes PK) tại máy chủ để loại bỏ tệp hỏng/giả mạo;</w:t>
-      </w:r>
-    </w:p>
-    <w:p>
-      <w:pPr>
-        <w:pStyle w:val="ListBullet"/>
-        <w:spacing w:before="40" w:after="60" w:line="288" w:lineRule="auto"/>
-        <w:jc w:val="both"/>
-      </w:pPr>
-      <w:r>
-        <w:rPr>
-          <w:rFonts w:ascii="Times New Roman" w:hAnsi="Times New Roman"/>
-          <w:b/>
-          <w:color w:val="0F172A"/>
-          <w:sz w:val="24"/>
-        </w:rPr>
-        <w:t xml:space="preserve">Lưu cơ sở dữ liệu: </w:t>
-      </w:r>
-      <w:r>
-        <w:rPr>
-          <w:rFonts w:ascii="Times New Roman" w:hAnsi="Times New Roman"/>
-          <w:color w:val="1E293B"/>
-          <w:sz w:val="24"/>
-        </w:rPr>
-        <w:t>Hoàn thiện luồng lưu trữ kết quả bóc tách an toàn vào cơ sở dữ liệu sau khi người dùng thẩm định xong;</w:t>
-      </w:r>
-    </w:p>
-    <w:p>
-      <w:pPr>
-        <w:pStyle w:val="ListBullet"/>
-        <w:spacing w:before="40" w:after="60" w:line="288" w:lineRule="auto"/>
-        <w:jc w:val="both"/>
-      </w:pPr>
-      <w:r>
-        <w:rPr>
-          <w:rFonts w:ascii="Times New Roman" w:hAnsi="Times New Roman"/>
-          <w:b/>
-          <w:color w:val="0F172A"/>
-          <w:sz w:val="24"/>
-        </w:rPr>
-        <w:t xml:space="preserve">Tính an toàn hệ thống: </w:t>
-      </w:r>
-      <w:r>
-        <w:rPr>
-          <w:rFonts w:ascii="Times New Roman" w:hAnsi="Times New Roman"/>
-          <w:color w:val="1E293B"/>
-          <w:sz w:val="24"/>
-        </w:rPr>
-        <w:t>Đảm bảo module hoạt động hoàn toàn độc lập theo cơ chế cắm ghép, tuyệt đối không gây xung đột hay ảnh hưởng đến các phân hệ báo cáo hiện hành của eForm.</w:t>
-      </w:r>
-    </w:p>
-    <w:p>
-      <w:pPr>
-        <w:spacing w:before="240" w:after="100"/>
+        <w:spacing w:before="260" w:after="100"/>
       </w:pPr>
       <w:r>
         <w:rPr>
@@ -1596,7 +1540,7 @@
                 <w:color w:val="334155"/>
                 <w:sz w:val="21"/>
               </w:rPr>
-              <w:t>Giao diện tinh gọn hai bước</w:t>
+              <w:t>Khóa tiêu đề, mở ô số liệu để sửa</w:t>
             </w:r>
           </w:p>
         </w:tc>
@@ -1621,7 +1565,7 @@
                 <w:color w:val="334155"/>
                 <w:sz w:val="21"/>
               </w:rPr>
-              <w:t>Bố cục rõ ràng, chỉ giữ các thông số nghiệp vụ cần thiết</w:t>
+              <w:t>Chỉ cho phép sửa tại ô dữ liệu, tiêu đề được bảo vệ</w:t>
             </w:r>
           </w:p>
         </w:tc>
@@ -1725,7 +1669,7 @@
                 <w:color w:val="334155"/>
                 <w:sz w:val="21"/>
               </w:rPr>
-              <w:t>Thanh chuyển đổi tab nhiều bảng</w:t>
+              <w:t>Bắt sự kiện sửa ô trên lưới</w:t>
             </w:r>
           </w:p>
         </w:tc>
@@ -1750,7 +1694,7 @@
                 <w:color w:val="334155"/>
                 <w:sz w:val="21"/>
               </w:rPr>
-              <w:t>Tự sinh các tab khi có nhiều bảng, chuyển tab mượt mà</w:t>
+              <w:t>Ô đổi viền cam hổ phách, hiện nút Lưu Cache</w:t>
             </w:r>
           </w:p>
         </w:tc>
@@ -1854,7 +1798,7 @@
                 <w:color w:val="334155"/>
                 <w:sz w:val="21"/>
               </w:rPr>
-              <w:t>Tự động ẩn tab đối với bảng đơn</w:t>
+              <w:t>Cơ chế tự học giảm tải gọi AI</w:t>
             </w:r>
           </w:p>
         </w:tc>
@@ -1879,7 +1823,7 @@
                 <w:color w:val="334155"/>
                 <w:sz w:val="21"/>
               </w:rPr>
-              <w:t>Ẩn tab khi chỉ có 1 bảng, tối ưu không gian hiển thị</w:t>
+              <w:t>Tải lại tệp: tự điền giá trị đã học, hiện thông báo xanh</w:t>
             </w:r>
           </w:p>
         </w:tc>
@@ -2434,7 +2378,7 @@
     </w:p>
     <w:p>
       <w:pPr>
-        <w:spacing w:before="240" w:after="100"/>
+        <w:spacing w:before="260" w:after="100"/>
       </w:pPr>
       <w:r>
         <w:rPr>
@@ -2459,7 +2403,7 @@
           <w:color w:val="0F172A"/>
           <w:sz w:val="24"/>
         </w:rPr>
-        <w:t xml:space="preserve">Ý nghĩa thực tiễn: </w:t>
+        <w:t xml:space="preserve">Hoàn thành mục tiêu học tập: </w:t>
       </w:r>
       <w:r>
         <w:rPr>
@@ -2467,7 +2411,7 @@
           <w:color w:val="1E293B"/>
           <w:sz w:val="24"/>
         </w:rPr>
-        <w:t>Giải pháp đã giải quyết được bài toán khó về việc nhập liệu các biểu mẫu Excel phức tạp có nhiều tầng tiêu đề và ô gộp trong ngành tư pháp, giúp tiết kiệm thời gian và giảm thiểu sai sót so với nhập thủ công.</w:t>
+        <w:t>Đề tài đã hoàn thành xuất sắc các mục tiêu đã đăng ký trong Kế hoạch học tập, giải quyết thành công bài toán tự động hóa nhập liệu các bảng biểu phức tạp trong ngành tư pháp.</w:t>
       </w:r>
     </w:p>
     <w:p>
@@ -2483,7 +2427,7 @@
           <w:color w:val="0F172A"/>
           <w:sz w:val="24"/>
         </w:rPr>
-        <w:t xml:space="preserve">Tính thân thiện: </w:t>
+        <w:t xml:space="preserve">Giá trị thực tiễn: </w:t>
       </w:r>
       <w:r>
         <w:rPr>
@@ -2491,7 +2435,7 @@
           <w:color w:val="1E293B"/>
           <w:sz w:val="24"/>
         </w:rPr>
-        <w:t>Giao diện được tinh giản tối đa, tập trung vào trải nghiệm của người dùng thực tế tại các địa phương.</w:t>
+        <w:t>Module có tính ứng dụng cao, giao diện trực quan, cơ chế tự học giúp hệ thống ngày càng thông minh hơn qua thời gian sử dụng.</w:t>
       </w:r>
     </w:p>
     <w:p>
@@ -2507,7 +2451,7 @@
           <w:color w:val="0F172A"/>
           <w:sz w:val="24"/>
         </w:rPr>
-        <w:t xml:space="preserve">Độ tin cậy kỹ thuật: </w:t>
+        <w:t xml:space="preserve">Thu hoạch cá nhân: </w:t>
       </w:r>
       <w:r>
         <w:rPr>
@@ -2515,36 +2459,12 @@
           <w:color w:val="1E293B"/>
           <w:sz w:val="24"/>
         </w:rPr>
-        <w:t>Cơ chế phòng vệ ngoại lệ đa tầng giúp hệ thống luôn vận hành ổn định và an toàn trước các tệp tin lỗi.</w:t>
+        <w:t>Sinh viên tích lũy được nhiều kinh nghiệm quý báu về quy trình phát triển phần mềm doanh nghiệp, kỹ năng phân tích thiết kế hệ thống và văn hóa làm việc chuyên nghiệp.</w:t>
       </w:r>
     </w:p>
     <w:p>
       <w:pPr>
-        <w:pStyle w:val="ListBullet"/>
-        <w:spacing w:before="40" w:after="60" w:line="288" w:lineRule="auto"/>
-        <w:jc w:val="both"/>
-      </w:pPr>
-      <w:r>
-        <w:rPr>
-          <w:rFonts w:ascii="Times New Roman" w:hAnsi="Times New Roman"/>
-          <w:b/>
-          <w:color w:val="0F172A"/>
-          <w:sz w:val="24"/>
-        </w:rPr>
-        <w:t xml:space="preserve">Sự trưởng thành cá nhân: </w:t>
-      </w:r>
-      <w:r>
-        <w:rPr>
-          <w:rFonts w:ascii="Times New Roman" w:hAnsi="Times New Roman"/>
-          <w:color w:val="1E293B"/>
-          <w:sz w:val="24"/>
-        </w:rPr>
-        <w:t>Qua quá trình thực tập, em đã học hỏi được phong cách làm việc chuyên nghiệp trong môi trường doanh nghiệp, kỹ năng giải quyết bài toán thực tế và tư duy xây dựng phần mềm an toàn, bền vững.</w:t>
-      </w:r>
-    </w:p>
-    <w:p>
-      <w:pPr>
-        <w:spacing w:before="240" w:after="100"/>
+        <w:spacing w:before="260" w:after="100"/>
       </w:pPr>
       <w:r>
         <w:rPr>
@@ -2568,7 +2488,7 @@
           <w:color w:val="1E293B"/>
           <w:sz w:val="24"/>
         </w:rPr>
-        <w:t>Em xin gửi lời cảm ơn chân thành và sâu sắc nhất tới Ban Giám đốc Công ty TNHH Nền tảng chuyển đổi số Việt Nam, tập thể các anh chị tại Khối Chính phủ số (eGov) và đặc biệt là anh Đào Đức Văn – người đã trực tiếp tận tình hướng dẫn, chỉ bảo và tạo mọi điều kiện thuận lợi nhất cho em trong suốt thời gian thực tập tốt nghiệp tại công ty.</w:t>
+        <w:t>Em xin bày tỏ lòng biết ơn sâu sắc tới Ban Giám đốc Công ty TNHH Nền tảng chuyển đổi số Việt Nam, các anh chị tại Khối Chính phủ số (eGov) và đặc biệt là anh Đào Đức Văn đã tận tình hướng dẫn, chỉ bảo chuyên môn và giúp đỡ em trong suốt quá trình thực tập tốt nghiệp này.</w:t>
       </w:r>
     </w:p>
     <w:sectPr>

</xml_diff>